<commit_message>
Update CAPTURE_INDEX with verified backflush protocol
Corrects the 07_backflush_cycle entry (the sparse B-channel during the
cycle is the app deliberately going quiet, not capture loss) and adds a
Verified Backflush Protocol section documenting the working sequence and
all four observed failure modes.

Co-Authored-By: Claude Fable 5 <noreply@anthropic.com>
</commit_message>
<xml_diff>
--- a/reference/captures/CAPTURE_INDEX.md.docx
+++ b/reference/captures/CAPTURE_INDEX.md.docx
@@ -936,60 +936,7 @@
         <w:rPr/>
       </w:pPr>
       <w:r>
-        <w:rPr>
-          <w:b w:val="1"/>
-          <w:bCs w:val="1"/>
-          <w:rtl w:val="0"/>
-        </w:rPr>
-        <w:t xml:space="preserve">Condition:</w:t>
-      </w:r>
-      <w:r>
-        <w:rPr>
-          <w:rtl w:val="0"/>
-        </w:rPr>
-        <w:t xml:space="preserve"> Backflush cycle initiated via LM app (with blind filter in basket). </w:t>
-      </w:r>
-      <w:r>
-        <w:rPr>
-          <w:b w:val="1"/>
-          <w:bCs w:val="1"/>
-          <w:rtl w:val="0"/>
-        </w:rPr>
-        <w:t xml:space="preserve">Duration:</w:t>
-      </w:r>
-      <w:r>
-        <w:rPr>
-          <w:rtl w:val="0"/>
-        </w:rPr>
-        <w:t xml:space="preserve"> ~30s (full cycle is ~130s) </w:t>
-      </w:r>
-      <w:r>
-        <w:rPr>
-          <w:b w:val="1"/>
-          <w:bCs w:val="1"/>
-          <w:rtl w:val="0"/>
-        </w:rPr>
-        <w:t xml:space="preserve">Key content:</w:t>
-      </w:r>
-      <w:r>
-        <w:rPr>
-          <w:rtl w:val="0"/>
-        </w:rPr>
-        <w:t xml:space="preserve"> W00E1 0001 82 repeated at ~1s intervals (6 commands in first 30s window). Dense Z-frames also present during backflush. R-frames continue interleaved. </w:t>
-      </w:r>
-      <w:r>
-        <w:rPr>
-          <w:b w:val="1"/>
-          <w:bCs w:val="1"/>
-          <w:rtl w:val="0"/>
-        </w:rPr>
-        <w:t xml:space="preserve">Use for:</w:t>
-      </w:r>
-      <w:r>
-        <w:rPr>
-          <w:rtl w:val="0"/>
-        </w:rPr>
-        <w:t xml:space="preserve"> Backflush command sequence; Z-frame presence during backflush.</w:t>
+        <w:t>Condition: Backflush cycle initiated via LM app (with blind filter in basket). Duration: ~130s captured. Key content: exactly 6x W00E1 0001 82 at 1s intervals (t=5.2..10.3s, lever DOWN), then NO further pulses; polling drops to ~one R40000023 per 10s during the cycle (the sparse B-channel 20-100s is the app going deliberately quiet, NOT sniffer loss - byte counts match exactly). Cycle runs t=15..95s: dense Z-frames throughout, z_shot_active held through pump pauses, single falling edge at the true end. Use for: Backflush command sequence; quiet-period polling; cycle-end detection. See the Verified Backflush Protocol section below.</w:t>
       </w:r>
     </w:p>
     <w:p>
@@ -2101,6 +2048,49 @@
         <w:rPr>
           <w:rtl w:val="0"/>
         </w:rPr>
+      </w:r>
+    </w:p>
+    <w:p>
+      <w:pPr>
+        <w:pStyle w:val="Heading1"/>
+      </w:pPr>
+      <w:r>
+        <w:t>Verified Backflush Protocol (2026-07-03, LineaMini_C6 commit 90f6e00)</w:t>
+      </w:r>
+    </w:p>
+    <w:p>
+      <w:r>
+        <w:t>Reverse-engineered from capture 07 plus four live failure modes on the real machine; implemented and user-verified working in machine.cpp/gicar.cpp/ui.cpp.</w:t>
+      </w:r>
+    </w:p>
+    <w:p>
+      <w:r>
+        <w:t>1. With the brew lever DOWN, send exactly 6x W00E1 0001 82 (frame W00E100018258) at 1-second intervals. A single pulse never engages the cycle (the one-shot machine_trigger_clean() that existed before 2026-07-03 never worked).</w:t>
+      </w:r>
+    </w:p>
+    <w:p>
+      <w:r>
+        <w:t>2. Lift the lever only AFTER the burst completes. Any 0x82 pulse that lands on an already-running cycle aborts it after one pump phase (~5s pump, then dead).</w:t>
+      </w:r>
+    </w:p>
+    <w:p>
+      <w:r>
+        <w:t>3. Stay near-silent for the duration of the cycle: R-polls slowed to one per 10s, no further pulses. Chattering at the machine at the normal 760ms poll cadence also aborts the cycle at a phase boundary.</w:t>
+      </w:r>
+    </w:p>
+    <w:p>
+      <w:r>
+        <w:t>4. The machine then runs the full cycle alone: ~80s, 10 pump on/off phases (user-counted on the real machine; ~8s per phase). The Z-stream flags the ENTIRE cycle as one continuous shot - z_shot_active stays 0x10 through the pump pauses, so individual phases are invisible in telemetry. The single z_shot_active falling edge (and end of the dense Z-stream) marks true cycle completion.</w:t>
+      </w:r>
+    </w:p>
+    <w:p>
+      <w:r>
+        <w:t>5. Restore normal 760ms polling after completion/cancel. Stopping the pulses during the initiation burst cancels cleanly; once running, the cycle completes on its own (the STOP path in firmware just stops pulses, restores polling, and instructs the user to lower the lever).</w:t>
+      </w:r>
+    </w:p>
+    <w:p>
+      <w:r>
+        <w:t>Failure modes observed while deriving this (all reproduce reliably): one-shot pulse = no cycle; continuous 1Hz pulses through the cycle = aborts after phase 1; 6-pulse burst with lever lifted mid-burst = aborts after phase 1; correct burst+quiet but normal 760ms polling = aborts after phase 1.</w:t>
       </w:r>
     </w:p>
     <w:sectPr>

</xml_diff>